<commit_message>
fix: purge synthetic dummy jobs, enforce strictly genuine live listings with zero 404 links, and preserve application status
</commit_message>
<xml_diff>
--- a/reports/interviews/Daily_Interview_Intelligence_2026-09-22.docx
+++ b/reports/interviews/Daily_Interview_Intelligence_2026-09-22.docx
@@ -39,7 +39,7 @@
     </w:p>
     <w:p>
       <w:r>
-        <w:t>This consolidated briefing synthesizes interview preparation across 14 qualifying high-match and applied enterprise opportunities for 2026-09-22. It integrates foundational knowledge (Level 1), systems architecture design (Level 2), and principal-grade trade-off cross-questioning (Level 3).</w:t>
+        <w:t>This consolidated briefing synthesizes interview preparation across 15 qualifying high-match and applied enterprise opportunities for 2026-09-22. It integrates foundational knowledge (Level 1), systems architecture design (Level 2), and principal-grade trade-off cross-questioning (Level 3).</w:t>
       </w:r>
     </w:p>
     <w:tbl>
@@ -137,7 +137,7 @@
               <w:rPr>
                 <w:sz w:val="18"/>
               </w:rPr>
-              <w:t>Oracle India</w:t>
+              <w:t>Maveric</w:t>
             </w:r>
           </w:p>
         </w:tc>
@@ -150,7 +150,7 @@
               <w:rPr>
                 <w:sz w:val="18"/>
               </w:rPr>
-              <w:t>Lead Oracle Cloud Infrastructure Architect</w:t>
+              <w:t>OCI Architect</w:t>
             </w:r>
           </w:p>
         </w:tc>
@@ -163,7 +163,7 @@
               <w:rPr>
                 <w:sz w:val="18"/>
               </w:rPr>
-              <w:t>77.0%</w:t>
+              <w:t>55.5%</w:t>
             </w:r>
           </w:p>
         </w:tc>
@@ -176,7 +176,7 @@
               <w:rPr>
                 <w:sz w:val="18"/>
               </w:rPr>
-              <w:t>34-52 Lacs P.A.</w:t>
+              <w:t>25-32.5 Lacs P.A.</w:t>
             </w:r>
           </w:p>
         </w:tc>
@@ -204,7 +204,7 @@
               <w:rPr>
                 <w:sz w:val="18"/>
               </w:rPr>
-              <w:t>Oracle India</w:t>
+              <w:t>Purview Services</w:t>
             </w:r>
           </w:p>
         </w:tc>
@@ -217,7 +217,7 @@
               <w:rPr>
                 <w:sz w:val="18"/>
               </w:rPr>
-              <w:t>Lead OCI Cloud Architect</w:t>
+              <w:t>OCI IDAM Security Lead</w:t>
             </w:r>
           </w:p>
         </w:tc>
@@ -230,7 +230,7 @@
               <w:rPr>
                 <w:sz w:val="18"/>
               </w:rPr>
-              <w:t>77.0%</w:t>
+              <w:t>52.5%</w:t>
             </w:r>
           </w:p>
         </w:tc>
@@ -243,7 +243,7 @@
               <w:rPr>
                 <w:sz w:val="18"/>
               </w:rPr>
-              <w:t>34-52 Lacs P.A.</w:t>
+              <w:t>15-22.5 Lacs P.A.</w:t>
             </w:r>
           </w:p>
         </w:tc>
@@ -271,7 +271,7 @@
               <w:rPr>
                 <w:sz w:val="18"/>
               </w:rPr>
-              <w:t>Oracle India</w:t>
+              <w:t>Tata Consultancy Services</w:t>
             </w:r>
           </w:p>
         </w:tc>
@@ -284,7 +284,7 @@
               <w:rPr>
                 <w:sz w:val="18"/>
               </w:rPr>
-              <w:t>Lead Oracle Cloud Administrator</w:t>
+              <w:t>Agentic AI architect - PAN INDIA</w:t>
             </w:r>
           </w:p>
         </w:tc>
@@ -297,7 +297,7 @@
               <w:rPr>
                 <w:sz w:val="18"/>
               </w:rPr>
-              <w:t>77.0%</w:t>
+              <w:t>58.0%</w:t>
             </w:r>
           </w:p>
         </w:tc>
@@ -310,7 +310,141 @@
               <w:rPr>
                 <w:sz w:val="18"/>
               </w:rPr>
-              <w:t>34-52 Lacs P.A.</w:t>
+              <w:t>Not Disclosed</w:t>
+            </w:r>
+          </w:p>
+        </w:tc>
+        <w:tc>
+          <w:tcPr>
+            <w:tcW w:type="dxa" w:w="2016"/>
+          </w:tcPr>
+          <w:p>
+            <w:r>
+              <w:rPr>
+                <w:sz w:val="18"/>
+              </w:rPr>
+              <w:t>OCI + GenAI Platform</w:t>
+            </w:r>
+          </w:p>
+        </w:tc>
+      </w:tr>
+      <w:tr>
+        <w:tc>
+          <w:tcPr>
+            <w:tcW w:type="dxa" w:w="2016"/>
+          </w:tcPr>
+          <w:p>
+            <w:r>
+              <w:rPr>
+                <w:sz w:val="18"/>
+              </w:rPr>
+              <w:t>Client of Sampoorna Consultants Pvt. Ltd</w:t>
+            </w:r>
+          </w:p>
+        </w:tc>
+        <w:tc>
+          <w:tcPr>
+            <w:tcW w:type="dxa" w:w="2016"/>
+          </w:tcPr>
+          <w:p>
+            <w:r>
+              <w:rPr>
+                <w:sz w:val="18"/>
+              </w:rPr>
+              <w:t>OCI AI Architect</w:t>
+            </w:r>
+          </w:p>
+        </w:tc>
+        <w:tc>
+          <w:tcPr>
+            <w:tcW w:type="dxa" w:w="2016"/>
+          </w:tcPr>
+          <w:p>
+            <w:r>
+              <w:rPr>
+                <w:sz w:val="18"/>
+              </w:rPr>
+              <w:t>60.4%</w:t>
+            </w:r>
+          </w:p>
+        </w:tc>
+        <w:tc>
+          <w:tcPr>
+            <w:tcW w:type="dxa" w:w="2016"/>
+          </w:tcPr>
+          <w:p>
+            <w:r>
+              <w:rPr>
+                <w:sz w:val="18"/>
+              </w:rPr>
+              <w:t>Not Disclosed</w:t>
+            </w:r>
+          </w:p>
+        </w:tc>
+        <w:tc>
+          <w:tcPr>
+            <w:tcW w:type="dxa" w:w="2016"/>
+          </w:tcPr>
+          <w:p>
+            <w:r>
+              <w:rPr>
+                <w:sz w:val="18"/>
+              </w:rPr>
+              <w:t>OCI + GenAI Platform</w:t>
+            </w:r>
+          </w:p>
+        </w:tc>
+      </w:tr>
+      <w:tr>
+        <w:tc>
+          <w:tcPr>
+            <w:tcW w:type="dxa" w:w="2016"/>
+          </w:tcPr>
+          <w:p>
+            <w:r>
+              <w:rPr>
+                <w:sz w:val="18"/>
+              </w:rPr>
+              <w:t>Valuelabs</w:t>
+            </w:r>
+          </w:p>
+        </w:tc>
+        <w:tc>
+          <w:tcPr>
+            <w:tcW w:type="dxa" w:w="2016"/>
+          </w:tcPr>
+          <w:p>
+            <w:r>
+              <w:rPr>
+                <w:sz w:val="18"/>
+              </w:rPr>
+              <w:t>OCI Security</w:t>
+            </w:r>
+          </w:p>
+        </w:tc>
+        <w:tc>
+          <w:tcPr>
+            <w:tcW w:type="dxa" w:w="2016"/>
+          </w:tcPr>
+          <w:p>
+            <w:r>
+              <w:rPr>
+                <w:sz w:val="18"/>
+              </w:rPr>
+              <w:t>52.5%</w:t>
+            </w:r>
+          </w:p>
+        </w:tc>
+        <w:tc>
+          <w:tcPr>
+            <w:tcW w:type="dxa" w:w="2016"/>
+          </w:tcPr>
+          <w:p>
+            <w:r>
+              <w:rPr>
+                <w:sz w:val="18"/>
+              </w:rPr>
+              <w:t>30-50 Lacs PA</w:t>
             </w:r>
           </w:p>
         </w:tc>
@@ -338,7 +472,7 @@
               <w:rPr>
                 <w:sz w:val="18"/>
               </w:rPr>
-              <w:t>Oracle India</w:t>
+              <w:t>Persistent</w:t>
             </w:r>
           </w:p>
         </w:tc>
@@ -351,7 +485,7 @@
               <w:rPr>
                 <w:sz w:val="18"/>
               </w:rPr>
-              <w:t>Lead OCI Cloud Administrator</w:t>
+              <w:t>AI Architect</w:t>
             </w:r>
           </w:p>
         </w:tc>
@@ -364,7 +498,7 @@
               <w:rPr>
                 <w:sz w:val="18"/>
               </w:rPr>
-              <w:t>77.0%</w:t>
+              <w:t>55.4%</w:t>
             </w:r>
           </w:p>
         </w:tc>
@@ -377,7 +511,275 @@
               <w:rPr>
                 <w:sz w:val="18"/>
               </w:rPr>
-              <w:t>34-52 Lacs P.A.</w:t>
+              <w:t>Not Disclosed</w:t>
+            </w:r>
+          </w:p>
+        </w:tc>
+        <w:tc>
+          <w:tcPr>
+            <w:tcW w:type="dxa" w:w="2016"/>
+          </w:tcPr>
+          <w:p>
+            <w:r>
+              <w:rPr>
+                <w:sz w:val="18"/>
+              </w:rPr>
+              <w:t>OCI + GenAI Platform</w:t>
+            </w:r>
+          </w:p>
+        </w:tc>
+      </w:tr>
+      <w:tr>
+        <w:tc>
+          <w:tcPr>
+            <w:tcW w:type="dxa" w:w="2016"/>
+          </w:tcPr>
+          <w:p>
+            <w:r>
+              <w:rPr>
+                <w:sz w:val="18"/>
+              </w:rPr>
+              <w:t>Tredence</w:t>
+            </w:r>
+          </w:p>
+        </w:tc>
+        <w:tc>
+          <w:tcPr>
+            <w:tcW w:type="dxa" w:w="2016"/>
+          </w:tcPr>
+          <w:p>
+            <w:r>
+              <w:rPr>
+                <w:sz w:val="18"/>
+              </w:rPr>
+              <w:t>Gen AI Architect</w:t>
+            </w:r>
+          </w:p>
+        </w:tc>
+        <w:tc>
+          <w:tcPr>
+            <w:tcW w:type="dxa" w:w="2016"/>
+          </w:tcPr>
+          <w:p>
+            <w:r>
+              <w:rPr>
+                <w:sz w:val="18"/>
+              </w:rPr>
+              <w:t>55.4%</w:t>
+            </w:r>
+          </w:p>
+        </w:tc>
+        <w:tc>
+          <w:tcPr>
+            <w:tcW w:type="dxa" w:w="2016"/>
+          </w:tcPr>
+          <w:p>
+            <w:r>
+              <w:rPr>
+                <w:sz w:val="18"/>
+              </w:rPr>
+              <w:t>Not Disclosed</w:t>
+            </w:r>
+          </w:p>
+        </w:tc>
+        <w:tc>
+          <w:tcPr>
+            <w:tcW w:type="dxa" w:w="2016"/>
+          </w:tcPr>
+          <w:p>
+            <w:r>
+              <w:rPr>
+                <w:sz w:val="18"/>
+              </w:rPr>
+              <w:t>OCI + GenAI Platform</w:t>
+            </w:r>
+          </w:p>
+        </w:tc>
+      </w:tr>
+      <w:tr>
+        <w:tc>
+          <w:tcPr>
+            <w:tcW w:type="dxa" w:w="2016"/>
+          </w:tcPr>
+          <w:p>
+            <w:r>
+              <w:rPr>
+                <w:sz w:val="18"/>
+              </w:rPr>
+              <w:t>GSPANN</w:t>
+            </w:r>
+          </w:p>
+        </w:tc>
+        <w:tc>
+          <w:tcPr>
+            <w:tcW w:type="dxa" w:w="2016"/>
+          </w:tcPr>
+          <w:p>
+            <w:r>
+              <w:rPr>
+                <w:sz w:val="18"/>
+              </w:rPr>
+              <w:t>AI/Artificial Intelligence  Architect</w:t>
+            </w:r>
+          </w:p>
+        </w:tc>
+        <w:tc>
+          <w:tcPr>
+            <w:tcW w:type="dxa" w:w="2016"/>
+          </w:tcPr>
+          <w:p>
+            <w:r>
+              <w:rPr>
+                <w:sz w:val="18"/>
+              </w:rPr>
+              <w:t>55.4%</w:t>
+            </w:r>
+          </w:p>
+        </w:tc>
+        <w:tc>
+          <w:tcPr>
+            <w:tcW w:type="dxa" w:w="2016"/>
+          </w:tcPr>
+          <w:p>
+            <w:r>
+              <w:rPr>
+                <w:sz w:val="18"/>
+              </w:rPr>
+              <w:t>Not Disclosed</w:t>
+            </w:r>
+          </w:p>
+        </w:tc>
+        <w:tc>
+          <w:tcPr>
+            <w:tcW w:type="dxa" w:w="2016"/>
+          </w:tcPr>
+          <w:p>
+            <w:r>
+              <w:rPr>
+                <w:sz w:val="18"/>
+              </w:rPr>
+              <w:t>OCI + GenAI Platform</w:t>
+            </w:r>
+          </w:p>
+        </w:tc>
+      </w:tr>
+      <w:tr>
+        <w:tc>
+          <w:tcPr>
+            <w:tcW w:type="dxa" w:w="2016"/>
+          </w:tcPr>
+          <w:p>
+            <w:r>
+              <w:rPr>
+                <w:sz w:val="18"/>
+              </w:rPr>
+              <w:t>Hiring for Infosys</w:t>
+            </w:r>
+          </w:p>
+        </w:tc>
+        <w:tc>
+          <w:tcPr>
+            <w:tcW w:type="dxa" w:w="2016"/>
+          </w:tcPr>
+          <w:p>
+            <w:r>
+              <w:rPr>
+                <w:sz w:val="18"/>
+              </w:rPr>
+              <w:t>Hiring For Gen AI Architects/ Lead Consultants</w:t>
+            </w:r>
+          </w:p>
+        </w:tc>
+        <w:tc>
+          <w:tcPr>
+            <w:tcW w:type="dxa" w:w="2016"/>
+          </w:tcPr>
+          <w:p>
+            <w:r>
+              <w:rPr>
+                <w:sz w:val="18"/>
+              </w:rPr>
+              <w:t>55.4%</w:t>
+            </w:r>
+          </w:p>
+        </w:tc>
+        <w:tc>
+          <w:tcPr>
+            <w:tcW w:type="dxa" w:w="2016"/>
+          </w:tcPr>
+          <w:p>
+            <w:r>
+              <w:rPr>
+                <w:sz w:val="18"/>
+              </w:rPr>
+              <w:t>20-35 Lacs PA</w:t>
+            </w:r>
+          </w:p>
+        </w:tc>
+        <w:tc>
+          <w:tcPr>
+            <w:tcW w:type="dxa" w:w="2016"/>
+          </w:tcPr>
+          <w:p>
+            <w:r>
+              <w:rPr>
+                <w:sz w:val="18"/>
+              </w:rPr>
+              <w:t>OCI + GenAI Platform</w:t>
+            </w:r>
+          </w:p>
+        </w:tc>
+      </w:tr>
+      <w:tr>
+        <w:tc>
+          <w:tcPr>
+            <w:tcW w:type="dxa" w:w="2016"/>
+          </w:tcPr>
+          <w:p>
+            <w:r>
+              <w:rPr>
+                <w:sz w:val="18"/>
+              </w:rPr>
+              <w:t>IT MNC</w:t>
+            </w:r>
+          </w:p>
+        </w:tc>
+        <w:tc>
+          <w:tcPr>
+            <w:tcW w:type="dxa" w:w="2016"/>
+          </w:tcPr>
+          <w:p>
+            <w:r>
+              <w:rPr>
+                <w:sz w:val="18"/>
+              </w:rPr>
+              <w:t>Artificial Intelligence Architect</w:t>
+            </w:r>
+          </w:p>
+        </w:tc>
+        <w:tc>
+          <w:tcPr>
+            <w:tcW w:type="dxa" w:w="2016"/>
+          </w:tcPr>
+          <w:p>
+            <w:r>
+              <w:rPr>
+                <w:sz w:val="18"/>
+              </w:rPr>
+              <w:t>53.3%</w:t>
+            </w:r>
+          </w:p>
+        </w:tc>
+        <w:tc>
+          <w:tcPr>
+            <w:tcW w:type="dxa" w:w="2016"/>
+          </w:tcPr>
+          <w:p>
+            <w:r>
+              <w:rPr>
+                <w:sz w:val="18"/>
+              </w:rPr>
+              <w:t>35-55 Lacs PA</w:t>
             </w:r>
           </w:p>
         </w:tc>
@@ -405,7 +807,7 @@
               <w:rPr>
                 <w:sz w:val="18"/>
               </w:rPr>
-              <w:t>Oracle India</w:t>
+              <w:t>Evnek</w:t>
             </w:r>
           </w:p>
         </w:tc>
@@ -418,7 +820,7 @@
               <w:rPr>
                 <w:sz w:val="18"/>
               </w:rPr>
-              <w:t>Lead OCI Architect</w:t>
+              <w:t>AI Architect</w:t>
             </w:r>
           </w:p>
         </w:tc>
@@ -431,7 +833,7 @@
               <w:rPr>
                 <w:sz w:val="18"/>
               </w:rPr>
-              <w:t>77.0%</w:t>
+              <w:t>55.4%</w:t>
             </w:r>
           </w:p>
         </w:tc>
@@ -444,7 +846,208 @@
               <w:rPr>
                 <w:sz w:val="18"/>
               </w:rPr>
-              <w:t>34-52 Lacs P.A.</w:t>
+              <w:t>Not Disclosed</w:t>
+            </w:r>
+          </w:p>
+        </w:tc>
+        <w:tc>
+          <w:tcPr>
+            <w:tcW w:type="dxa" w:w="2016"/>
+          </w:tcPr>
+          <w:p>
+            <w:r>
+              <w:rPr>
+                <w:sz w:val="18"/>
+              </w:rPr>
+              <w:t>OCI + GenAI Platform</w:t>
+            </w:r>
+          </w:p>
+        </w:tc>
+      </w:tr>
+      <w:tr>
+        <w:tc>
+          <w:tcPr>
+            <w:tcW w:type="dxa" w:w="2016"/>
+          </w:tcPr>
+          <w:p>
+            <w:r>
+              <w:rPr>
+                <w:sz w:val="18"/>
+              </w:rPr>
+              <w:t>Luxoft</w:t>
+            </w:r>
+          </w:p>
+        </w:tc>
+        <w:tc>
+          <w:tcPr>
+            <w:tcW w:type="dxa" w:w="2016"/>
+          </w:tcPr>
+          <w:p>
+            <w:r>
+              <w:rPr>
+                <w:sz w:val="18"/>
+              </w:rPr>
+              <w:t>AI Architect</w:t>
+            </w:r>
+          </w:p>
+        </w:tc>
+        <w:tc>
+          <w:tcPr>
+            <w:tcW w:type="dxa" w:w="2016"/>
+          </w:tcPr>
+          <w:p>
+            <w:r>
+              <w:rPr>
+                <w:sz w:val="18"/>
+              </w:rPr>
+              <w:t>55.4%</w:t>
+            </w:r>
+          </w:p>
+        </w:tc>
+        <w:tc>
+          <w:tcPr>
+            <w:tcW w:type="dxa" w:w="2016"/>
+          </w:tcPr>
+          <w:p>
+            <w:r>
+              <w:rPr>
+                <w:sz w:val="18"/>
+              </w:rPr>
+              <w:t>Not Disclosed</w:t>
+            </w:r>
+          </w:p>
+        </w:tc>
+        <w:tc>
+          <w:tcPr>
+            <w:tcW w:type="dxa" w:w="2016"/>
+          </w:tcPr>
+          <w:p>
+            <w:r>
+              <w:rPr>
+                <w:sz w:val="18"/>
+              </w:rPr>
+              <w:t>OCI + GenAI Platform</w:t>
+            </w:r>
+          </w:p>
+        </w:tc>
+      </w:tr>
+      <w:tr>
+        <w:tc>
+          <w:tcPr>
+            <w:tcW w:type="dxa" w:w="2016"/>
+          </w:tcPr>
+          <w:p>
+            <w:r>
+              <w:rPr>
+                <w:sz w:val="18"/>
+              </w:rPr>
+              <w:t>Tata Consultancy Services</w:t>
+            </w:r>
+          </w:p>
+        </w:tc>
+        <w:tc>
+          <w:tcPr>
+            <w:tcW w:type="dxa" w:w="2016"/>
+          </w:tcPr>
+          <w:p>
+            <w:r>
+              <w:rPr>
+                <w:sz w:val="18"/>
+              </w:rPr>
+              <w:t>Agentic AI architect - PAN INDIA</w:t>
+            </w:r>
+          </w:p>
+        </w:tc>
+        <w:tc>
+          <w:tcPr>
+            <w:tcW w:type="dxa" w:w="2016"/>
+          </w:tcPr>
+          <w:p>
+            <w:r>
+              <w:rPr>
+                <w:sz w:val="18"/>
+              </w:rPr>
+              <w:t>58.0%</w:t>
+            </w:r>
+          </w:p>
+        </w:tc>
+        <w:tc>
+          <w:tcPr>
+            <w:tcW w:type="dxa" w:w="2016"/>
+          </w:tcPr>
+          <w:p>
+            <w:r>
+              <w:rPr>
+                <w:sz w:val="18"/>
+              </w:rPr>
+              <w:t>Not Disclosed</w:t>
+            </w:r>
+          </w:p>
+        </w:tc>
+        <w:tc>
+          <w:tcPr>
+            <w:tcW w:type="dxa" w:w="2016"/>
+          </w:tcPr>
+          <w:p>
+            <w:r>
+              <w:rPr>
+                <w:sz w:val="18"/>
+              </w:rPr>
+              <w:t>OCI + GenAI Platform</w:t>
+            </w:r>
+          </w:p>
+        </w:tc>
+      </w:tr>
+      <w:tr>
+        <w:tc>
+          <w:tcPr>
+            <w:tcW w:type="dxa" w:w="2016"/>
+          </w:tcPr>
+          <w:p>
+            <w:r>
+              <w:rPr>
+                <w:sz w:val="18"/>
+              </w:rPr>
+              <w:t>Coforge</w:t>
+            </w:r>
+          </w:p>
+        </w:tc>
+        <w:tc>
+          <w:tcPr>
+            <w:tcW w:type="dxa" w:w="2016"/>
+          </w:tcPr>
+          <w:p>
+            <w:r>
+              <w:rPr>
+                <w:sz w:val="18"/>
+              </w:rPr>
+              <w:t>Artificial Intelligence Architect</w:t>
+            </w:r>
+          </w:p>
+        </w:tc>
+        <w:tc>
+          <w:tcPr>
+            <w:tcW w:type="dxa" w:w="2016"/>
+          </w:tcPr>
+          <w:p>
+            <w:r>
+              <w:rPr>
+                <w:sz w:val="18"/>
+              </w:rPr>
+              <w:t>53.3%</w:t>
+            </w:r>
+          </w:p>
+        </w:tc>
+        <w:tc>
+          <w:tcPr>
+            <w:tcW w:type="dxa" w:w="2016"/>
+          </w:tcPr>
+          <w:p>
+            <w:r>
+              <w:rPr>
+                <w:sz w:val="18"/>
+              </w:rPr>
+              <w:t>35-50 Lacs PA</w:t>
             </w:r>
           </w:p>
         </w:tc>
@@ -472,7 +1075,7 @@
               <w:rPr>
                 <w:sz w:val="18"/>
               </w:rPr>
-              <w:t>Oracle India</w:t>
+              <w:t>Evnek</w:t>
             </w:r>
           </w:p>
         </w:tc>
@@ -485,7 +1088,7 @@
               <w:rPr>
                 <w:sz w:val="18"/>
               </w:rPr>
-              <w:t>Lead Principal OCI Architect</w:t>
+              <w:t>AI Architect</w:t>
             </w:r>
           </w:p>
         </w:tc>
@@ -498,543 +1101,7 @@
               <w:rPr>
                 <w:sz w:val="18"/>
               </w:rPr>
-              <w:t>77.0%</w:t>
-            </w:r>
-          </w:p>
-        </w:tc>
-        <w:tc>
-          <w:tcPr>
-            <w:tcW w:type="dxa" w:w="2016"/>
-          </w:tcPr>
-          <w:p>
-            <w:r>
-              <w:rPr>
-                <w:sz w:val="18"/>
-              </w:rPr>
-              <w:t>34-52 Lacs P.A.</w:t>
-            </w:r>
-          </w:p>
-        </w:tc>
-        <w:tc>
-          <w:tcPr>
-            <w:tcW w:type="dxa" w:w="2016"/>
-          </w:tcPr>
-          <w:p>
-            <w:r>
-              <w:rPr>
-                <w:sz w:val="18"/>
-              </w:rPr>
-              <w:t>Enterprise OCI Cloud</w:t>
-            </w:r>
-          </w:p>
-        </w:tc>
-      </w:tr>
-      <w:tr>
-        <w:tc>
-          <w:tcPr>
-            <w:tcW w:type="dxa" w:w="2016"/>
-          </w:tcPr>
-          <w:p>
-            <w:r>
-              <w:rPr>
-                <w:sz w:val="18"/>
-              </w:rPr>
-              <w:t>Oracle India</w:t>
-            </w:r>
-          </w:p>
-        </w:tc>
-        <w:tc>
-          <w:tcPr>
-            <w:tcW w:type="dxa" w:w="2016"/>
-          </w:tcPr>
-          <w:p>
-            <w:r>
-              <w:rPr>
-                <w:sz w:val="18"/>
-              </w:rPr>
-              <w:t>Lead OCI Solutions Architect</w:t>
-            </w:r>
-          </w:p>
-        </w:tc>
-        <w:tc>
-          <w:tcPr>
-            <w:tcW w:type="dxa" w:w="2016"/>
-          </w:tcPr>
-          <w:p>
-            <w:r>
-              <w:rPr>
-                <w:sz w:val="18"/>
-              </w:rPr>
-              <w:t>77.0%</w:t>
-            </w:r>
-          </w:p>
-        </w:tc>
-        <w:tc>
-          <w:tcPr>
-            <w:tcW w:type="dxa" w:w="2016"/>
-          </w:tcPr>
-          <w:p>
-            <w:r>
-              <w:rPr>
-                <w:sz w:val="18"/>
-              </w:rPr>
-              <w:t>34-52 Lacs P.A.</w:t>
-            </w:r>
-          </w:p>
-        </w:tc>
-        <w:tc>
-          <w:tcPr>
-            <w:tcW w:type="dxa" w:w="2016"/>
-          </w:tcPr>
-          <w:p>
-            <w:r>
-              <w:rPr>
-                <w:sz w:val="18"/>
-              </w:rPr>
-              <w:t>Enterprise OCI Cloud</w:t>
-            </w:r>
-          </w:p>
-        </w:tc>
-      </w:tr>
-      <w:tr>
-        <w:tc>
-          <w:tcPr>
-            <w:tcW w:type="dxa" w:w="2016"/>
-          </w:tcPr>
-          <w:p>
-            <w:r>
-              <w:rPr>
-                <w:sz w:val="18"/>
-              </w:rPr>
-              <w:t>Oracle India</w:t>
-            </w:r>
-          </w:p>
-        </w:tc>
-        <w:tc>
-          <w:tcPr>
-            <w:tcW w:type="dxa" w:w="2016"/>
-          </w:tcPr>
-          <w:p>
-            <w:r>
-              <w:rPr>
-                <w:sz w:val="18"/>
-              </w:rPr>
-              <w:t>Lead Oracle Cloud Infrastructure Administrator</w:t>
-            </w:r>
-          </w:p>
-        </w:tc>
-        <w:tc>
-          <w:tcPr>
-            <w:tcW w:type="dxa" w:w="2016"/>
-          </w:tcPr>
-          <w:p>
-            <w:r>
-              <w:rPr>
-                <w:sz w:val="18"/>
-              </w:rPr>
-              <w:t>77.0%</w:t>
-            </w:r>
-          </w:p>
-        </w:tc>
-        <w:tc>
-          <w:tcPr>
-            <w:tcW w:type="dxa" w:w="2016"/>
-          </w:tcPr>
-          <w:p>
-            <w:r>
-              <w:rPr>
-                <w:sz w:val="18"/>
-              </w:rPr>
-              <w:t>34-52 Lacs P.A.</w:t>
-            </w:r>
-          </w:p>
-        </w:tc>
-        <w:tc>
-          <w:tcPr>
-            <w:tcW w:type="dxa" w:w="2016"/>
-          </w:tcPr>
-          <w:p>
-            <w:r>
-              <w:rPr>
-                <w:sz w:val="18"/>
-              </w:rPr>
-              <w:t>Enterprise OCI Cloud</w:t>
-            </w:r>
-          </w:p>
-        </w:tc>
-      </w:tr>
-      <w:tr>
-        <w:tc>
-          <w:tcPr>
-            <w:tcW w:type="dxa" w:w="2016"/>
-          </w:tcPr>
-          <w:p>
-            <w:r>
-              <w:rPr>
-                <w:sz w:val="18"/>
-              </w:rPr>
-              <w:t>Oracle India</w:t>
-            </w:r>
-          </w:p>
-        </w:tc>
-        <w:tc>
-          <w:tcPr>
-            <w:tcW w:type="dxa" w:w="2016"/>
-          </w:tcPr>
-          <w:p>
-            <w:r>
-              <w:rPr>
-                <w:sz w:val="18"/>
-              </w:rPr>
-              <w:t>Lead Oracle Cloud Lead</w:t>
-            </w:r>
-          </w:p>
-        </w:tc>
-        <w:tc>
-          <w:tcPr>
-            <w:tcW w:type="dxa" w:w="2016"/>
-          </w:tcPr>
-          <w:p>
-            <w:r>
-              <w:rPr>
-                <w:sz w:val="18"/>
-              </w:rPr>
-              <w:t>77.0%</w:t>
-            </w:r>
-          </w:p>
-        </w:tc>
-        <w:tc>
-          <w:tcPr>
-            <w:tcW w:type="dxa" w:w="2016"/>
-          </w:tcPr>
-          <w:p>
-            <w:r>
-              <w:rPr>
-                <w:sz w:val="18"/>
-              </w:rPr>
-              <w:t>34-52 Lacs P.A.</w:t>
-            </w:r>
-          </w:p>
-        </w:tc>
-        <w:tc>
-          <w:tcPr>
-            <w:tcW w:type="dxa" w:w="2016"/>
-          </w:tcPr>
-          <w:p>
-            <w:r>
-              <w:rPr>
-                <w:sz w:val="18"/>
-              </w:rPr>
-              <w:t>Enterprise OCI Cloud</w:t>
-            </w:r>
-          </w:p>
-        </w:tc>
-      </w:tr>
-      <w:tr>
-        <w:tc>
-          <w:tcPr>
-            <w:tcW w:type="dxa" w:w="2016"/>
-          </w:tcPr>
-          <w:p>
-            <w:r>
-              <w:rPr>
-                <w:sz w:val="18"/>
-              </w:rPr>
-              <w:t>Oracle India</w:t>
-            </w:r>
-          </w:p>
-        </w:tc>
-        <w:tc>
-          <w:tcPr>
-            <w:tcW w:type="dxa" w:w="2016"/>
-          </w:tcPr>
-          <w:p>
-            <w:r>
-              <w:rPr>
-                <w:sz w:val="18"/>
-              </w:rPr>
-              <w:t>Lead OCI DevOps Architect</w:t>
-            </w:r>
-          </w:p>
-        </w:tc>
-        <w:tc>
-          <w:tcPr>
-            <w:tcW w:type="dxa" w:w="2016"/>
-          </w:tcPr>
-          <w:p>
-            <w:r>
-              <w:rPr>
-                <w:sz w:val="18"/>
-              </w:rPr>
-              <w:t>77.0%</w:t>
-            </w:r>
-          </w:p>
-        </w:tc>
-        <w:tc>
-          <w:tcPr>
-            <w:tcW w:type="dxa" w:w="2016"/>
-          </w:tcPr>
-          <w:p>
-            <w:r>
-              <w:rPr>
-                <w:sz w:val="18"/>
-              </w:rPr>
-              <w:t>34-52 Lacs P.A.</w:t>
-            </w:r>
-          </w:p>
-        </w:tc>
-        <w:tc>
-          <w:tcPr>
-            <w:tcW w:type="dxa" w:w="2016"/>
-          </w:tcPr>
-          <w:p>
-            <w:r>
-              <w:rPr>
-                <w:sz w:val="18"/>
-              </w:rPr>
-              <w:t>Enterprise OCI Cloud</w:t>
-            </w:r>
-          </w:p>
-        </w:tc>
-      </w:tr>
-      <w:tr>
-        <w:tc>
-          <w:tcPr>
-            <w:tcW w:type="dxa" w:w="2016"/>
-          </w:tcPr>
-          <w:p>
-            <w:r>
-              <w:rPr>
-                <w:sz w:val="18"/>
-              </w:rPr>
-              <w:t>Oracle India</w:t>
-            </w:r>
-          </w:p>
-        </w:tc>
-        <w:tc>
-          <w:tcPr>
-            <w:tcW w:type="dxa" w:w="2016"/>
-          </w:tcPr>
-          <w:p>
-            <w:r>
-              <w:rPr>
-                <w:sz w:val="18"/>
-              </w:rPr>
-              <w:t>Lead Oracle Cloud Migration Architect</w:t>
-            </w:r>
-          </w:p>
-        </w:tc>
-        <w:tc>
-          <w:tcPr>
-            <w:tcW w:type="dxa" w:w="2016"/>
-          </w:tcPr>
-          <w:p>
-            <w:r>
-              <w:rPr>
-                <w:sz w:val="18"/>
-              </w:rPr>
-              <w:t>77.0%</w:t>
-            </w:r>
-          </w:p>
-        </w:tc>
-        <w:tc>
-          <w:tcPr>
-            <w:tcW w:type="dxa" w:w="2016"/>
-          </w:tcPr>
-          <w:p>
-            <w:r>
-              <w:rPr>
-                <w:sz w:val="18"/>
-              </w:rPr>
-              <w:t>34-52 Lacs P.A.</w:t>
-            </w:r>
-          </w:p>
-        </w:tc>
-        <w:tc>
-          <w:tcPr>
-            <w:tcW w:type="dxa" w:w="2016"/>
-          </w:tcPr>
-          <w:p>
-            <w:r>
-              <w:rPr>
-                <w:sz w:val="18"/>
-              </w:rPr>
-              <w:t>Enterprise OCI Cloud</w:t>
-            </w:r>
-          </w:p>
-        </w:tc>
-      </w:tr>
-      <w:tr>
-        <w:tc>
-          <w:tcPr>
-            <w:tcW w:type="dxa" w:w="2016"/>
-          </w:tcPr>
-          <w:p>
-            <w:r>
-              <w:rPr>
-                <w:sz w:val="18"/>
-              </w:rPr>
-              <w:t>Oracle India</w:t>
-            </w:r>
-          </w:p>
-        </w:tc>
-        <w:tc>
-          <w:tcPr>
-            <w:tcW w:type="dxa" w:w="2016"/>
-          </w:tcPr>
-          <w:p>
-            <w:r>
-              <w:rPr>
-                <w:sz w:val="18"/>
-              </w:rPr>
-              <w:t>Lead OCI Platform Architect</w:t>
-            </w:r>
-          </w:p>
-        </w:tc>
-        <w:tc>
-          <w:tcPr>
-            <w:tcW w:type="dxa" w:w="2016"/>
-          </w:tcPr>
-          <w:p>
-            <w:r>
-              <w:rPr>
-                <w:sz w:val="18"/>
-              </w:rPr>
-              <w:t>77.0%</w:t>
-            </w:r>
-          </w:p>
-        </w:tc>
-        <w:tc>
-          <w:tcPr>
-            <w:tcW w:type="dxa" w:w="2016"/>
-          </w:tcPr>
-          <w:p>
-            <w:r>
-              <w:rPr>
-                <w:sz w:val="18"/>
-              </w:rPr>
-              <w:t>34-52 Lacs P.A.</w:t>
-            </w:r>
-          </w:p>
-        </w:tc>
-        <w:tc>
-          <w:tcPr>
-            <w:tcW w:type="dxa" w:w="2016"/>
-          </w:tcPr>
-          <w:p>
-            <w:r>
-              <w:rPr>
-                <w:sz w:val="18"/>
-              </w:rPr>
-              <w:t>Enterprise OCI Cloud</w:t>
-            </w:r>
-          </w:p>
-        </w:tc>
-      </w:tr>
-      <w:tr>
-        <w:tc>
-          <w:tcPr>
-            <w:tcW w:type="dxa" w:w="2016"/>
-          </w:tcPr>
-          <w:p>
-            <w:r>
-              <w:rPr>
-                <w:sz w:val="18"/>
-              </w:rPr>
-              <w:t>Oracle Financial Services</w:t>
-            </w:r>
-          </w:p>
-        </w:tc>
-        <w:tc>
-          <w:tcPr>
-            <w:tcW w:type="dxa" w:w="2016"/>
-          </w:tcPr>
-          <w:p>
-            <w:r>
-              <w:rPr>
-                <w:sz w:val="18"/>
-              </w:rPr>
-              <w:t>Principal Cloud Architect - GenAI &amp; AI Platform</w:t>
-            </w:r>
-          </w:p>
-        </w:tc>
-        <w:tc>
-          <w:tcPr>
-            <w:tcW w:type="dxa" w:w="2016"/>
-          </w:tcPr>
-          <w:p>
-            <w:r>
-              <w:rPr>
-                <w:sz w:val="18"/>
-              </w:rPr>
-              <w:t>86.7%</w:t>
-            </w:r>
-          </w:p>
-        </w:tc>
-        <w:tc>
-          <w:tcPr>
-            <w:tcW w:type="dxa" w:w="2016"/>
-          </w:tcPr>
-          <w:p>
-            <w:r>
-              <w:rPr>
-                <w:sz w:val="18"/>
-              </w:rPr>
-              <w:t>28-40 Lacs P.A.</w:t>
-            </w:r>
-          </w:p>
-        </w:tc>
-        <w:tc>
-          <w:tcPr>
-            <w:tcW w:type="dxa" w:w="2016"/>
-          </w:tcPr>
-          <w:p>
-            <w:r>
-              <w:rPr>
-                <w:sz w:val="18"/>
-              </w:rPr>
-              <w:t>OCI + GenAI Platform</w:t>
-            </w:r>
-          </w:p>
-        </w:tc>
-      </w:tr>
-      <w:tr>
-        <w:tc>
-          <w:tcPr>
-            <w:tcW w:type="dxa" w:w="2016"/>
-          </w:tcPr>
-          <w:p>
-            <w:r>
-              <w:rPr>
-                <w:sz w:val="18"/>
-              </w:rPr>
-              <w:t>Accenture Enterprise Solutions</w:t>
-            </w:r>
-          </w:p>
-        </w:tc>
-        <w:tc>
-          <w:tcPr>
-            <w:tcW w:type="dxa" w:w="2016"/>
-          </w:tcPr>
-          <w:p>
-            <w:r>
-              <w:rPr>
-                <w:sz w:val="18"/>
-              </w:rPr>
-              <w:t>Principal AI Platform Architect</w:t>
-            </w:r>
-          </w:p>
-        </w:tc>
-        <w:tc>
-          <w:tcPr>
-            <w:tcW w:type="dxa" w:w="2016"/>
-          </w:tcPr>
-          <w:p>
-            <w:r>
-              <w:rPr>
-                <w:sz w:val="18"/>
-              </w:rPr>
-              <w:t>82.8%</w:t>
+              <w:t>55.4%</w:t>
             </w:r>
           </w:p>
         </w:tc>
@@ -1187,11 +1254,11 @@
         <w:rPr>
           <w:b/>
         </w:rPr>
-        <w:t>• Oracle India — Lead Oracle Cloud Infrastructure Architect (Match: 77.0%):</w:t>
+        <w:t>• Maveric — OCI Architect (Match: 55.5%):</w:t>
         <w:br/>
       </w:r>
       <w:r>
-        <w:t xml:space="preserve">  - Key Strengths to Emphasize: Verified OCI Deep Expertise (6+ years, 6 Professional certifications, DBSS telecom architecture), Verified OKE private cluster architecture &amp; persistent storage (FSS), Verified Terraform modular infrastructure-as-code automation (~60% deployment reduction)</w:t>
+        <w:t xml:space="preserve">  - Key Strengths to Emphasize: Verified OCI Deep Expertise (6+ years, 6 Professional certifications, DBSS telecom architecture)</w:t>
         <w:br/>
         <w:t xml:space="preserve">  - Strategic Angle: Position your 12+ years of enterprise IT leadership and 6.5+ years of OCI mastery as an instant de-risking factor for their modernization roadmap.</w:t>
         <w:br/>
@@ -1202,11 +1269,11 @@
         <w:rPr>
           <w:b/>
         </w:rPr>
-        <w:t>• Oracle India — Lead OCI Cloud Architect (Match: 77.0%):</w:t>
+        <w:t>• Purview Services — OCI IDAM Security Lead (Match: 52.5%):</w:t>
         <w:br/>
       </w:r>
       <w:r>
-        <w:t xml:space="preserve">  - Key Strengths to Emphasize: Verified OCI Deep Expertise (6+ years, 6 Professional certifications, DBSS telecom architecture), Verified OKE private cluster architecture &amp; persistent storage (FSS), Verified Terraform modular infrastructure-as-code automation (~60% deployment reduction)</w:t>
+        <w:t xml:space="preserve">  - Key Strengths to Emphasize: Verified OCI Deep Expertise (6+ years, 6 Professional certifications, DBSS telecom architecture), Verified IAM federation (Azure AD / Okta / SAML SSO), air-gapped isolation &amp; PAM hardening</w:t>
         <w:br/>
         <w:t xml:space="preserve">  - Strategic Angle: Position your 12+ years of enterprise IT leadership and 6.5+ years of OCI mastery as an instant de-risking factor for their modernization roadmap.</w:t>
         <w:br/>
@@ -1217,11 +1284,11 @@
         <w:rPr>
           <w:b/>
         </w:rPr>
-        <w:t>• Oracle India — Lead Oracle Cloud Administrator (Match: 77.0%):</w:t>
+        <w:t>• Tata Consultancy Services — Agentic AI architect - PAN INDIA (Match: 58.0%):</w:t>
         <w:br/>
       </w:r>
       <w:r>
-        <w:t xml:space="preserve">  - Key Strengths to Emphasize: Verified OCI Deep Expertise (6+ years, 6 Professional certifications, DBSS telecom architecture), Verified OKE private cluster architecture &amp; persistent storage (FSS), Verified Terraform modular infrastructure-as-code automation (~60% deployment reduction)</w:t>
+        <w:t xml:space="preserve">  - Key Strengths to Emphasize: Deep cloud architecture, container platforms, enterprise security</w:t>
         <w:br/>
         <w:t xml:space="preserve">  - Strategic Angle: Position your 12+ years of enterprise IT leadership and 6.5+ years of OCI mastery as an instant de-risking factor for their modernization roadmap.</w:t>
         <w:br/>
@@ -1232,11 +1299,11 @@
         <w:rPr>
           <w:b/>
         </w:rPr>
-        <w:t>• Oracle India — Lead OCI Cloud Administrator (Match: 77.0%):</w:t>
+        <w:t>• Client of Sampoorna Consultants Pvt. Ltd — OCI AI Architect (Match: 60.4%):</w:t>
         <w:br/>
       </w:r>
       <w:r>
-        <w:t xml:space="preserve">  - Key Strengths to Emphasize: Verified OCI Deep Expertise (6+ years, 6 Professional certifications, DBSS telecom architecture), Verified OKE private cluster architecture &amp; persistent storage (FSS), Verified Terraform modular infrastructure-as-code automation (~60% deployment reduction)</w:t>
+        <w:t xml:space="preserve">  - Key Strengths to Emphasize: Verified OCI Deep Expertise (6+ years, 6 Professional certifications, DBSS telecom architecture)</w:t>
         <w:br/>
         <w:t xml:space="preserve">  - Strategic Angle: Position your 12+ years of enterprise IT leadership and 6.5+ years of OCI mastery as an instant de-risking factor for their modernization roadmap.</w:t>
         <w:br/>
@@ -1247,11 +1314,11 @@
         <w:rPr>
           <w:b/>
         </w:rPr>
-        <w:t>• Oracle India — Lead OCI Architect (Match: 77.0%):</w:t>
+        <w:t>• Valuelabs — OCI Security (Match: 52.5%):</w:t>
         <w:br/>
       </w:r>
       <w:r>
-        <w:t xml:space="preserve">  - Key Strengths to Emphasize: Verified OCI Deep Expertise (6+ years, 6 Professional certifications, DBSS telecom architecture), Verified OKE private cluster architecture &amp; persistent storage (FSS), Verified Terraform modular infrastructure-as-code automation (~60% deployment reduction)</w:t>
+        <w:t xml:space="preserve">  - Key Strengths to Emphasize: Verified OCI Deep Expertise (6+ years, 6 Professional certifications, DBSS telecom architecture), Verified IAM federation (Azure AD / Okta / SAML SSO), air-gapped isolation &amp; PAM hardening</w:t>
         <w:br/>
         <w:t xml:space="preserve">  - Strategic Angle: Position your 12+ years of enterprise IT leadership and 6.5+ years of OCI mastery as an instant de-risking factor for their modernization roadmap.</w:t>
         <w:br/>
@@ -1262,11 +1329,11 @@
         <w:rPr>
           <w:b/>
         </w:rPr>
-        <w:t>• Oracle India — Lead Principal OCI Architect (Match: 77.0%):</w:t>
+        <w:t>• Persistent — AI Architect (Match: 55.4%):</w:t>
         <w:br/>
       </w:r>
       <w:r>
-        <w:t xml:space="preserve">  - Key Strengths to Emphasize: Verified OCI Deep Expertise (6+ years, 6 Professional certifications, DBSS telecom architecture), Verified OKE private cluster architecture &amp; persistent storage (FSS), Verified Terraform modular infrastructure-as-code automation (~60% deployment reduction)</w:t>
+        <w:t xml:space="preserve">  - Key Strengths to Emphasize: Deep cloud architecture, container platforms, enterprise security</w:t>
         <w:br/>
         <w:t xml:space="preserve">  - Strategic Angle: Position your 12+ years of enterprise IT leadership and 6.5+ years of OCI mastery as an instant de-risking factor for their modernization roadmap.</w:t>
         <w:br/>
@@ -1277,11 +1344,11 @@
         <w:rPr>
           <w:b/>
         </w:rPr>
-        <w:t>• Oracle India — Lead OCI Solutions Architect (Match: 77.0%):</w:t>
+        <w:t>• Tredence — Gen AI Architect (Match: 55.4%):</w:t>
         <w:br/>
       </w:r>
       <w:r>
-        <w:t xml:space="preserve">  - Key Strengths to Emphasize: Verified OCI Deep Expertise (6+ years, 6 Professional certifications, DBSS telecom architecture), Verified OKE private cluster architecture &amp; persistent storage (FSS), Verified Terraform modular infrastructure-as-code automation (~60% deployment reduction)</w:t>
+        <w:t xml:space="preserve">  - Key Strengths to Emphasize: Deep cloud architecture, container platforms, enterprise security</w:t>
         <w:br/>
         <w:t xml:space="preserve">  - Strategic Angle: Position your 12+ years of enterprise IT leadership and 6.5+ years of OCI mastery as an instant de-risking factor for their modernization roadmap.</w:t>
         <w:br/>
@@ -1292,11 +1359,11 @@
         <w:rPr>
           <w:b/>
         </w:rPr>
-        <w:t>• Oracle India — Lead Oracle Cloud Infrastructure Administrator (Match: 77.0%):</w:t>
+        <w:t>• GSPANN — AI/Artificial Intelligence  Architect (Match: 55.4%):</w:t>
         <w:br/>
       </w:r>
       <w:r>
-        <w:t xml:space="preserve">  - Key Strengths to Emphasize: Verified OCI Deep Expertise (6+ years, 6 Professional certifications, DBSS telecom architecture), Verified OKE private cluster architecture &amp; persistent storage (FSS), Verified Terraform modular infrastructure-as-code automation (~60% deployment reduction)</w:t>
+        <w:t xml:space="preserve">  - Key Strengths to Emphasize: Deep cloud architecture, container platforms, enterprise security</w:t>
         <w:br/>
         <w:t xml:space="preserve">  - Strategic Angle: Position your 12+ years of enterprise IT leadership and 6.5+ years of OCI mastery as an instant de-risking factor for their modernization roadmap.</w:t>
         <w:br/>
@@ -1307,11 +1374,11 @@
         <w:rPr>
           <w:b/>
         </w:rPr>
-        <w:t>• Oracle India — Lead Oracle Cloud Lead (Match: 77.0%):</w:t>
+        <w:t>• Hiring for Infosys — Hiring For Gen AI Architects/ Lead Consultants (Match: 55.4%):</w:t>
         <w:br/>
       </w:r>
       <w:r>
-        <w:t xml:space="preserve">  - Key Strengths to Emphasize: Verified OCI Deep Expertise (6+ years, 6 Professional certifications, DBSS telecom architecture), Verified OKE private cluster architecture &amp; persistent storage (FSS), Verified Terraform modular infrastructure-as-code automation (~60% deployment reduction)</w:t>
+        <w:t xml:space="preserve">  - Key Strengths to Emphasize: Deep cloud architecture, container platforms, enterprise security</w:t>
         <w:br/>
         <w:t xml:space="preserve">  - Strategic Angle: Position your 12+ years of enterprise IT leadership and 6.5+ years of OCI mastery as an instant de-risking factor for their modernization roadmap.</w:t>
         <w:br/>
@@ -1322,11 +1389,11 @@
         <w:rPr>
           <w:b/>
         </w:rPr>
-        <w:t>• Oracle India — Lead OCI DevOps Architect (Match: 77.0%):</w:t>
+        <w:t>• IT MNC — Artificial Intelligence Architect (Match: 53.3%):</w:t>
         <w:br/>
       </w:r>
       <w:r>
-        <w:t xml:space="preserve">  - Key Strengths to Emphasize: Verified OCI Deep Expertise (6+ years, 6 Professional certifications, DBSS telecom architecture), Verified OKE private cluster architecture &amp; persistent storage (FSS), Verified Terraform modular infrastructure-as-code automation (~60% deployment reduction)</w:t>
+        <w:t xml:space="preserve">  - Key Strengths to Emphasize: Deep cloud architecture, container platforms, enterprise security</w:t>
         <w:br/>
         <w:t xml:space="preserve">  - Strategic Angle: Position your 12+ years of enterprise IT leadership and 6.5+ years of OCI mastery as an instant de-risking factor for their modernization roadmap.</w:t>
         <w:br/>
@@ -1337,11 +1404,11 @@
         <w:rPr>
           <w:b/>
         </w:rPr>
-        <w:t>• Oracle India — Lead Oracle Cloud Migration Architect (Match: 77.0%):</w:t>
+        <w:t>• Evnek — AI Architect (Match: 55.4%):</w:t>
         <w:br/>
       </w:r>
       <w:r>
-        <w:t xml:space="preserve">  - Key Strengths to Emphasize: Verified OCI Deep Expertise (6+ years, 6 Professional certifications, DBSS telecom architecture), Verified OKE private cluster architecture &amp; persistent storage (FSS), Verified Terraform modular infrastructure-as-code automation (~60% deployment reduction)</w:t>
+        <w:t xml:space="preserve">  - Key Strengths to Emphasize: Deep cloud architecture, container platforms, enterprise security</w:t>
         <w:br/>
         <w:t xml:space="preserve">  - Strategic Angle: Position your 12+ years of enterprise IT leadership and 6.5+ years of OCI mastery as an instant de-risking factor for their modernization roadmap.</w:t>
         <w:br/>
@@ -1352,11 +1419,11 @@
         <w:rPr>
           <w:b/>
         </w:rPr>
-        <w:t>• Oracle India — Lead OCI Platform Architect (Match: 77.0%):</w:t>
+        <w:t>• Luxoft — AI Architect (Match: 55.4%):</w:t>
         <w:br/>
       </w:r>
       <w:r>
-        <w:t xml:space="preserve">  - Key Strengths to Emphasize: Verified OCI Deep Expertise (6+ years, 6 Professional certifications, DBSS telecom architecture), Verified OKE private cluster architecture &amp; persistent storage (FSS), Verified Terraform modular infrastructure-as-code automation (~60% deployment reduction)</w:t>
+        <w:t xml:space="preserve">  - Key Strengths to Emphasize: Deep cloud architecture, container platforms, enterprise security</w:t>
         <w:br/>
         <w:t xml:space="preserve">  - Strategic Angle: Position your 12+ years of enterprise IT leadership and 6.5+ years of OCI mastery as an instant de-risking factor for their modernization roadmap.</w:t>
         <w:br/>
@@ -1367,11 +1434,11 @@
         <w:rPr>
           <w:b/>
         </w:rPr>
-        <w:t>• Oracle Financial Services — Principal Cloud Architect - GenAI &amp; AI Platform (Match: 86.7%):</w:t>
+        <w:t>• Tata Consultancy Services — Agentic AI architect - PAN INDIA (Match: 58.0%):</w:t>
         <w:br/>
       </w:r>
       <w:r>
-        <w:t xml:space="preserve">  - Key Strengths to Emphasize: Verified OCI Deep Expertise (6+ years, 6 Professional certifications, DBSS telecom architecture), Verified LLMOps &amp; GenAI platform engineering (ChatOps CLI, local LLMs, MCP servers), Verified OKE private cluster architecture &amp; persistent storage (FSS)</w:t>
+        <w:t xml:space="preserve">  - Key Strengths to Emphasize: Deep cloud architecture, container platforms, enterprise security</w:t>
         <w:br/>
         <w:t xml:space="preserve">  - Strategic Angle: Position your 12+ years of enterprise IT leadership and 6.5+ years of OCI mastery as an instant de-risking factor for their modernization roadmap.</w:t>
         <w:br/>
@@ -1382,11 +1449,26 @@
         <w:rPr>
           <w:b/>
         </w:rPr>
-        <w:t>• Accenture Enterprise Solutions — Principal AI Platform Architect (Match: 82.8%):</w:t>
+        <w:t>• Coforge — Artificial Intelligence Architect (Match: 53.3%):</w:t>
         <w:br/>
       </w:r>
       <w:r>
-        <w:t xml:space="preserve">  - Key Strengths to Emphasize: Verified OCI Deep Expertise (6+ years, 6 Professional certifications, DBSS telecom architecture), Verified OKE private cluster architecture &amp; persistent storage (FSS), Verified IAM federation (Azure AD / Okta / SAML SSO), air-gapped isolation &amp; PAM hardening</w:t>
+        <w:t xml:space="preserve">  - Key Strengths to Emphasize: Deep cloud architecture, container platforms, enterprise security</w:t>
+        <w:br/>
+        <w:t xml:space="preserve">  - Strategic Angle: Position your 12+ years of enterprise IT leadership and 6.5+ years of OCI mastery as an instant de-risking factor for their modernization roadmap.</w:t>
+        <w:br/>
+      </w:r>
+    </w:p>
+    <w:p>
+      <w:r>
+        <w:rPr>
+          <w:b/>
+        </w:rPr>
+        <w:t>• Evnek — AI Architect (Match: 55.4%):</w:t>
+        <w:br/>
+      </w:r>
+      <w:r>
+        <w:t xml:space="preserve">  - Key Strengths to Emphasize: Deep cloud architecture, container platforms, enterprise security</w:t>
         <w:br/>
         <w:t xml:space="preserve">  - Strategic Angle: Position your 12+ years of enterprise IT leadership and 6.5+ years of OCI mastery as an instant de-risking factor for their modernization roadmap.</w:t>
         <w:br/>

</xml_diff>